<commit_message>
Update speech text for real plans and interior photos
Slides 11, 13 and 18 now use real drawings and photos instead of drawn
schemes; the RU and EN speech texts and image credits follow.

Co-Authored-By: Claude Opus 5.5 <noreply@anthropic.com>
Claude-Session: https://claude.ai/code/session_01ALEGhzSr6wURM9LJX1Efuy
</commit_message>
<xml_diff>
--- a/De_Stijl_speech_EN.docx
+++ b/De_Stijl_speech_EN.docx
@@ -1729,7 +1729,23 @@
           <w:sz w:val="24"/>
           <w:szCs w:val="24"/>
         </w:rPr>
-        <w:t xml:space="preserve">To understand the house, let’s look at it from above. On the left is the </w:t>
+        <w:t xml:space="preserve">To understand the house, let’s look at it from above. These are </w:t>
+      </w:r>
+      <w:r>
+        <w:rPr>
+          <w:b/>
+          <w:bCs/>
+          <w:sz w:val="24"/>
+          <w:szCs w:val="24"/>
+        </w:rPr>
+        <w:t xml:space="preserve">real plans</w:t>
+      </w:r>
+      <w:r>
+        <w:rPr>
+          <w:sz w:val="24"/>
+          <w:szCs w:val="24"/>
+        </w:rPr>
+        <w:t xml:space="preserve">. On the left is the </w:t>
       </w:r>
       <w:r>
         <w:rPr>
@@ -1745,7 +1761,53 @@
           <w:sz w:val="24"/>
           <w:szCs w:val="24"/>
         </w:rPr>
-        <w:t xml:space="preserve">, on the right the </w:t>
+        <w:t xml:space="preserve">: fixed walls and separate rooms around the </w:t>
+      </w:r>
+      <w:r>
+        <w:rPr>
+          <w:b/>
+          <w:bCs/>
+          <w:sz w:val="24"/>
+          <w:szCs w:val="24"/>
+        </w:rPr>
+        <w:t xml:space="preserve">staircase</w:t>
+      </w:r>
+      <w:r>
+        <w:rPr>
+          <w:sz w:val="24"/>
+          <w:szCs w:val="24"/>
+        </w:rPr>
+        <w:t xml:space="preserve"> — the hall and entrance, a big </w:t>
+      </w:r>
+      <w:r>
+        <w:rPr>
+          <w:b/>
+          <w:bCs/>
+          <w:sz w:val="24"/>
+          <w:szCs w:val="24"/>
+        </w:rPr>
+        <w:t xml:space="preserve">kitchen, dining and living room</w:t>
+      </w:r>
+      <w:r>
+        <w:rPr>
+          <w:sz w:val="24"/>
+          <w:szCs w:val="24"/>
+        </w:rPr>
+        <w:t xml:space="preserve">, a reading room, a room for working, a bedroom and a studio.</w:t>
+      </w:r>
+    </w:p>
+    <w:p>
+      <w:pPr>
+        <w:keepNext w:val="false"/>
+        <w:keepLines/>
+        <w:spacing w:after="100" w:line="312"/>
+      </w:pPr>
+      <w:r>
+        <w:rPr>
+          <w:sz w:val="24"/>
+          <w:szCs w:val="24"/>
+        </w:rPr>
+        <w:t xml:space="preserve">On the right is the </w:t>
       </w:r>
       <w:r>
         <w:rPr>
@@ -1761,99 +1823,7 @@
           <w:sz w:val="24"/>
           <w:szCs w:val="24"/>
         </w:rPr>
-        <w:t xml:space="preserve">. The street is at the bottom, and on the left is the neighbours’ house.</w:t>
-      </w:r>
-    </w:p>
-    <w:p>
-      <w:pPr>
-        <w:keepNext/>
-        <w:keepLines/>
-        <w:spacing w:after="100" w:line="312"/>
-      </w:pPr>
-      <w:r>
-        <w:rPr>
-          <w:sz w:val="24"/>
-          <w:szCs w:val="24"/>
-        </w:rPr>
-        <w:t xml:space="preserve">The </w:t>
-      </w:r>
-      <w:r>
-        <w:rPr>
-          <w:b/>
-          <w:bCs/>
-          <w:sz w:val="24"/>
-          <w:szCs w:val="24"/>
-        </w:rPr>
-        <w:t xml:space="preserve">ground floor</w:t>
-      </w:r>
-      <w:r>
-        <w:rPr>
-          <w:sz w:val="24"/>
-          <w:szCs w:val="24"/>
-        </w:rPr>
-        <w:t xml:space="preserve"> is quite traditional: fixed walls and separate rooms around the </w:t>
-      </w:r>
-      <w:r>
-        <w:rPr>
-          <w:b/>
-          <w:bCs/>
-          <w:sz w:val="24"/>
-          <w:szCs w:val="24"/>
-        </w:rPr>
-        <w:t xml:space="preserve">staircase in the centre</w:t>
-      </w:r>
-      <w:r>
-        <w:rPr>
-          <w:sz w:val="24"/>
-          <w:szCs w:val="24"/>
-        </w:rPr>
-        <w:t xml:space="preserve"> — the hall, a big </w:t>
-      </w:r>
-      <w:r>
-        <w:rPr>
-          <w:b/>
-          <w:bCs/>
-          <w:sz w:val="24"/>
-          <w:szCs w:val="24"/>
-        </w:rPr>
-        <w:t xml:space="preserve">kitchen and dining room</w:t>
-      </w:r>
-      <w:r>
-        <w:rPr>
-          <w:sz w:val="24"/>
-          <w:szCs w:val="24"/>
-        </w:rPr>
-        <w:t xml:space="preserve">, a reading room, a work room, a maid’s room and a studio that Rietveld used.</w:t>
-      </w:r>
-    </w:p>
-    <w:p>
-      <w:pPr>
-        <w:keepNext w:val="false"/>
-        <w:keepLines/>
-        <w:spacing w:after="100" w:line="312"/>
-      </w:pPr>
-      <w:r>
-        <w:rPr>
-          <w:sz w:val="24"/>
-          <w:szCs w:val="24"/>
-        </w:rPr>
-        <w:t xml:space="preserve">Now let’s go upstairs. The </w:t>
-      </w:r>
-      <w:r>
-        <w:rPr>
-          <w:b/>
-          <w:bCs/>
-          <w:sz w:val="24"/>
-          <w:szCs w:val="24"/>
-        </w:rPr>
-        <w:t xml:space="preserve">upper floor</w:t>
-      </w:r>
-      <w:r>
-        <w:rPr>
-          <w:sz w:val="24"/>
-          <w:szCs w:val="24"/>
-        </w:rPr>
-        <w:t xml:space="preserve"> is completely different: apart from the bathroom and the toilet, there are </w:t>
+        <w:t xml:space="preserve">. It is completely different: apart from the bathroom and the toilet, there are </w:t>
       </w:r>
       <w:r>
         <w:rPr>
@@ -1869,23 +1839,7 @@
           <w:sz w:val="24"/>
           <w:szCs w:val="24"/>
         </w:rPr>
-        <w:t xml:space="preserve">. It is one open space: the living and dining area with the famous </w:t>
-      </w:r>
-      <w:r>
-        <w:rPr>
-          <w:b/>
-          <w:bCs/>
-          <w:sz w:val="24"/>
-          <w:szCs w:val="24"/>
-        </w:rPr>
-        <w:t xml:space="preserve">corner window</w:t>
-      </w:r>
-      <w:r>
-        <w:rPr>
-          <w:sz w:val="24"/>
-          <w:szCs w:val="24"/>
-        </w:rPr>
-        <w:t xml:space="preserve">, Truus’s room, a corner for the girls and a corner for her son with his piano.</w:t>
+        <w:t xml:space="preserve">. It is one open space around the stairs — you can see the dining table, the piano and the beds along the walls. By day it was one big room.</w:t>
       </w:r>
     </w:p>
     <w:p>
@@ -1914,7 +1868,7 @@
           <w:sz w:val="20"/>
           <w:szCs w:val="20"/>
         </w:rPr>
-        <w:t xml:space="preserve">How to read a plan: it is a view from above, as if the roof were taken off and the house were cut horizontally about one metre above the floor. The thick black lines are walls, the rectangle with stripes in the centre is the staircase (the stripes are the steps), and the red mark is the front door. “Not to scale” means the proportions are approximate: it is a scheme, not an exact architectural drawing.</w:t>
+        <w:t xml:space="preserve">How to read a plan: it is a view from above, as if the roof were taken off and the house were cut horizontally about one metre above the floor. Thick lines are walls, thin lines are furniture and windows, and the arcs show how the doors open. The ground-floor plan (scale 1:100) comes from ArchDaily; its labels are in English: STUDIO, WORKING, SLEEPING, READING, HALL, KITCHEN/DINING/LIVING, WC, ENTRANCE. The upper-floor plan comes from Wikimedia Commons; its French caption “plan étage ouvert, parois repoussées” means “upper floor open, panels pushed back”. The red labels (stairs, bath, piano, dining) were added on the slide.</w:t>
       </w:r>
     </w:p>
     <w:p>
@@ -2094,7 +2048,7 @@
           <w:sz w:val="20"/>
           <w:szCs w:val="20"/>
         </w:rPr>
-        <w:t xml:space="preserve">   ·   ≈ 0:45</w:t>
+        <w:t xml:space="preserve">   ·   ≈ 0:50</w:t>
       </w:r>
     </w:p>
     <w:p>
@@ -2126,78 +2080,101 @@
           <w:sz w:val="24"/>
           <w:szCs w:val="24"/>
         </w:rPr>
-        <w:t xml:space="preserve">This scheme shows how the walls really move. The </w:t>
-      </w:r>
-      <w:r>
-        <w:rPr>
-          <w:b/>
-          <w:bCs/>
-          <w:sz w:val="24"/>
-          <w:szCs w:val="24"/>
-        </w:rPr>
-        <w:t xml:space="preserve">red lines</w:t>
-      </w:r>
-      <w:r>
-        <w:rPr>
-          <w:sz w:val="24"/>
-          <w:szCs w:val="24"/>
-        </w:rPr>
-        <w:t xml:space="preserve"> are sliding panels, the </w:t>
-      </w:r>
-      <w:r>
-        <w:rPr>
-          <w:b/>
-          <w:bCs/>
-          <w:sz w:val="24"/>
-          <w:szCs w:val="24"/>
-        </w:rPr>
-        <w:t xml:space="preserve">black lines</w:t>
-      </w:r>
-      <w:r>
-        <w:rPr>
-          <w:sz w:val="24"/>
-          <w:szCs w:val="24"/>
-        </w:rPr>
-        <w:t xml:space="preserve"> are fixed walls.</w:t>
-      </w:r>
-    </w:p>
-    <w:p>
-      <w:pPr>
-        <w:keepNext/>
-        <w:keepLines/>
-        <w:spacing w:after="100" w:line="312"/>
-      </w:pPr>
-      <w:r>
-        <w:rPr>
-          <w:b/>
-          <w:bCs/>
-          <w:sz w:val="24"/>
-          <w:szCs w:val="24"/>
-        </w:rPr>
-        <w:t xml:space="preserve">By day</w:t>
-      </w:r>
-      <w:r>
-        <w:rPr>
-          <w:sz w:val="24"/>
-          <w:szCs w:val="24"/>
-        </w:rPr>
-        <w:t xml:space="preserve">, on the left, the panels are pushed back to the walls, and the whole floor is </w:t>
-      </w:r>
-      <w:r>
-        <w:rPr>
-          <w:b/>
-          <w:bCs/>
-          <w:sz w:val="24"/>
-          <w:szCs w:val="24"/>
-        </w:rPr>
-        <w:t xml:space="preserve">one big room</w:t>
-      </w:r>
-      <w:r>
-        <w:rPr>
-          <w:sz w:val="24"/>
-          <w:szCs w:val="24"/>
-        </w:rPr>
-        <w:t xml:space="preserve"> for playing, music, work and meals.</w:t>
+        <w:t xml:space="preserve">How did it work? At the top are two plans of the same upper floor. On the left the panels are </w:t>
+      </w:r>
+      <w:r>
+        <w:rPr>
+          <w:b/>
+          <w:bCs/>
+          <w:sz w:val="24"/>
+          <w:szCs w:val="24"/>
+        </w:rPr>
+        <w:t xml:space="preserve">pushed back</w:t>
+      </w:r>
+      <w:r>
+        <w:rPr>
+          <w:sz w:val="24"/>
+          <w:szCs w:val="24"/>
+        </w:rPr>
+        <w:t xml:space="preserve"> — one open space. On the right the panels are </w:t>
+      </w:r>
+      <w:r>
+        <w:rPr>
+          <w:b/>
+          <w:bCs/>
+          <w:sz w:val="24"/>
+          <w:szCs w:val="24"/>
+        </w:rPr>
+        <w:t xml:space="preserve">closed</w:t>
+      </w:r>
+      <w:r>
+        <w:rPr>
+          <w:sz w:val="24"/>
+          <w:szCs w:val="24"/>
+        </w:rPr>
+        <w:t xml:space="preserve"> — now there are separate rooms: bedrooms for the children, the mother’s room, the bathroom and the living room.</w:t>
+      </w:r>
+    </w:p>
+    <w:p>
+      <w:pPr>
+        <w:keepNext/>
+        <w:keepLines/>
+        <w:spacing w:after="100" w:line="312"/>
+      </w:pPr>
+      <w:r>
+        <w:rPr>
+          <w:sz w:val="24"/>
+          <w:szCs w:val="24"/>
+        </w:rPr>
+        <w:t xml:space="preserve">The panels are hidden along the walls and run on </w:t>
+      </w:r>
+      <w:r>
+        <w:rPr>
+          <w:b/>
+          <w:bCs/>
+          <w:sz w:val="24"/>
+          <w:szCs w:val="24"/>
+        </w:rPr>
+        <w:t xml:space="preserve">tracks in the floor and ceiling</w:t>
+      </w:r>
+      <w:r>
+        <w:rPr>
+          <w:sz w:val="24"/>
+          <w:szCs w:val="24"/>
+        </w:rPr>
+        <w:t xml:space="preserve">, like sliding doors; some of them turn. </w:t>
+      </w:r>
+      <w:r>
+        <w:rPr>
+          <w:b/>
+          <w:bCs/>
+          <w:sz w:val="24"/>
+          <w:szCs w:val="24"/>
+        </w:rPr>
+        <w:t xml:space="preserve">In the evening</w:t>
+      </w:r>
+      <w:r>
+        <w:rPr>
+          <w:sz w:val="24"/>
+          <w:szCs w:val="24"/>
+        </w:rPr>
+        <w:t xml:space="preserve"> the family pulled them out, </w:t>
+      </w:r>
+      <w:r>
+        <w:rPr>
+          <w:b/>
+          <w:bCs/>
+          <w:sz w:val="24"/>
+          <w:szCs w:val="24"/>
+        </w:rPr>
+        <w:t xml:space="preserve">in the morning</w:t>
+      </w:r>
+      <w:r>
+        <w:rPr>
+          <w:sz w:val="24"/>
+          <w:szCs w:val="24"/>
+        </w:rPr>
+        <w:t xml:space="preserve"> they pushed them back.</w:t>
       </w:r>
     </w:p>
     <w:p>
@@ -2208,67 +2185,10 @@
       </w:pPr>
       <w:r>
         <w:rPr>
-          <w:b/>
-          <w:bCs/>
-          <w:sz w:val="24"/>
-          <w:szCs w:val="24"/>
-        </w:rPr>
-        <w:t xml:space="preserve">In the evening</w:t>
-      </w:r>
-      <w:r>
-        <w:rPr>
-          <w:sz w:val="24"/>
-          <w:szCs w:val="24"/>
-        </w:rPr>
-        <w:t xml:space="preserve">, on the right, the panels are pulled out like sliding doors, and some of them turn. Now there is a </w:t>
-      </w:r>
-      <w:r>
-        <w:rPr>
-          <w:b/>
-          <w:bCs/>
-          <w:sz w:val="24"/>
-          <w:szCs w:val="24"/>
-        </w:rPr>
-        <w:t xml:space="preserve">bedroom for the two daughters</w:t>
-      </w:r>
-      <w:r>
-        <w:rPr>
-          <w:sz w:val="24"/>
-          <w:szCs w:val="24"/>
-        </w:rPr>
-        <w:t xml:space="preserve">, a </w:t>
-      </w:r>
-      <w:r>
-        <w:rPr>
-          <w:b/>
-          <w:bCs/>
-          <w:sz w:val="24"/>
-          <w:szCs w:val="24"/>
-        </w:rPr>
-        <w:t xml:space="preserve">bedroom for the son</w:t>
-      </w:r>
-      <w:r>
-        <w:rPr>
-          <w:sz w:val="24"/>
-          <w:szCs w:val="24"/>
-        </w:rPr>
-        <w:t xml:space="preserve">, a small hall by the stairs and the living room. </w:t>
-      </w:r>
-      <w:r>
-        <w:rPr>
-          <w:b/>
-          <w:bCs/>
-          <w:sz w:val="24"/>
-          <w:szCs w:val="24"/>
-        </w:rPr>
-        <w:t xml:space="preserve">In the morning</w:t>
-      </w:r>
-      <w:r>
-        <w:rPr>
-          <w:sz w:val="24"/>
-          <w:szCs w:val="24"/>
-        </w:rPr>
-        <w:t xml:space="preserve"> everything is pushed back again — a “transformer” flat, a hundred years ago!</w:t>
+          <w:sz w:val="24"/>
+          <w:szCs w:val="24"/>
+        </w:rPr>
+        <w:t xml:space="preserve">The photos at the bottom show the same floor today: open on the left, and on the right with the panels closed between the son’s and the daughters’ rooms — a “transformer” flat, a hundred years ago!</w:t>
       </w:r>
     </w:p>
     <w:p>
@@ -2297,7 +2217,7 @@
           <w:sz w:val="20"/>
           <w:szCs w:val="20"/>
         </w:rPr>
-        <w:t xml:space="preserve">At night the floor becomes three bedrooms (the daughters’, the son’s and the mother’s), a bathroom and a living room; by day it is one space. The children were the son Binnert and the daughters Marjan and Han. The youngest, Han Schröder, later became an architect herself.</w:t>
+        <w:t xml:space="preserve">Tip: compare the two plans — the extra lines that appear only on the right are the closed panels. At night the floor became three bedrooms (the daughters’, the son’s and the mother’s), a bathroom and a living room. The children were the son Binnert and the daughters Marjan and Han; the youngest, Han Schröder, later became an architect herself. The plans are captioned in French: “plan étage ouvert” = upper floor open, “plan étage” = upper floor (closed).</w:t>
       </w:r>
     </w:p>
     <w:p>
@@ -3272,7 +3192,7 @@
           <w:sz w:val="20"/>
           <w:szCs w:val="20"/>
         </w:rPr>
-        <w:t xml:space="preserve">   ·   ≈ 0:45</w:t>
+        <w:t xml:space="preserve">   ·   ≈ 0:50</w:t>
       </w:r>
     </w:p>
     <w:p>
@@ -3398,39 +3318,23 @@
           <w:sz w:val="24"/>
           <w:szCs w:val="24"/>
         </w:rPr>
-        <w:t xml:space="preserve">The drawing on the slide is a simple </w:t>
-      </w:r>
-      <w:r>
-        <w:rPr>
-          <w:b/>
-          <w:bCs/>
-          <w:sz w:val="24"/>
-          <w:szCs w:val="24"/>
-        </w:rPr>
-        <w:t xml:space="preserve">section</w:t>
-      </w:r>
-      <w:r>
-        <w:rPr>
-          <w:sz w:val="24"/>
-          <w:szCs w:val="24"/>
-        </w:rPr>
-        <w:t xml:space="preserve"> — a cut through the building. </w:t>
-      </w:r>
-      <w:r>
-        <w:rPr>
-          <w:b/>
-          <w:bCs/>
-          <w:sz w:val="24"/>
-          <w:szCs w:val="24"/>
-        </w:rPr>
-        <w:t xml:space="preserve">Four floors of galleries</w:t>
-      </w:r>
-      <w:r>
-        <w:rPr>
-          <w:sz w:val="24"/>
-          <w:szCs w:val="24"/>
-        </w:rPr>
-        <w:t xml:space="preserve"> are arranged around one tall </w:t>
+        <w:t xml:space="preserve">At the bottom you can see the </w:t>
+      </w:r>
+      <w:r>
+        <w:rPr>
+          <w:b/>
+          <w:bCs/>
+          <w:sz w:val="24"/>
+          <w:szCs w:val="24"/>
+        </w:rPr>
+        <w:t xml:space="preserve">inside</w:t>
+      </w:r>
+      <w:r>
+        <w:rPr>
+          <w:sz w:val="24"/>
+          <w:szCs w:val="24"/>
+        </w:rPr>
+        <w:t xml:space="preserve">. On the left, the </w:t>
       </w:r>
       <w:r>
         <w:rPr>
@@ -3446,7 +3350,39 @@
           <w:sz w:val="24"/>
           <w:szCs w:val="24"/>
         </w:rPr>
-        <w:t xml:space="preserve"> with an open staircase, and daylight falls into the hall through </w:t>
+        <w:t xml:space="preserve"> from above: a tall open space with an </w:t>
+      </w:r>
+      <w:r>
+        <w:rPr>
+          <w:b/>
+          <w:bCs/>
+          <w:sz w:val="24"/>
+          <w:szCs w:val="24"/>
+        </w:rPr>
+        <w:t xml:space="preserve">open staircase</w:t>
+      </w:r>
+      <w:r>
+        <w:rPr>
+          <w:sz w:val="24"/>
+          <w:szCs w:val="24"/>
+        </w:rPr>
+        <w:t xml:space="preserve"> in the middle. On the right, the same stair from the first floor, with the </w:t>
+      </w:r>
+      <w:r>
+        <w:rPr>
+          <w:b/>
+          <w:bCs/>
+          <w:sz w:val="24"/>
+          <w:szCs w:val="24"/>
+        </w:rPr>
+        <w:t xml:space="preserve">galleries</w:t>
+      </w:r>
+      <w:r>
+        <w:rPr>
+          <w:sz w:val="24"/>
+          <w:szCs w:val="24"/>
+        </w:rPr>
+        <w:t xml:space="preserve"> around it. Four floors of galleries open onto this hall, and daylight falls into it from </w:t>
       </w:r>
       <w:r>
         <w:rPr>
@@ -3491,7 +3427,7 @@
           <w:sz w:val="20"/>
           <w:szCs w:val="20"/>
         </w:rPr>
-        <w:t xml:space="preserve">A section is a drawing of a building cut vertically, like a cake, so that you can see the floors inside. There are 36 square skylights above the hall. The partners who finished the museum were J. van Dillen and J. van Tricht. In 1999 a new wing by the Japanese architect Kisho Kurokawa was added, and in 2015 a new glass entrance hall.</w:t>
+        <w:t xml:space="preserve">There are 36 square skylights above the hall. The partners who finished the museum were J. van Dillen and J. van Tricht. In 1999 a new wing by the Japanese architect Kisho Kurokawa was added, and in 2015 a new glass entrance hall. The interior photos are from Wikimedia Commons.</w:t>
       </w:r>
     </w:p>
     <w:p>
@@ -4438,6 +4374,30 @@
           <w:sz w:val="21"/>
           <w:szCs w:val="21"/>
         </w:rPr>
+        <w:t xml:space="preserve">ArchDaily — AD Classics: Rietveld Schröder House / Gerrit Rietveld (archdaily.com).</w:t>
+      </w:r>
+    </w:p>
+    <w:p>
+      <w:pPr>
+        <w:spacing w:after="60" w:line="276"/>
+      </w:pPr>
+      <w:r>
+        <w:rPr>
+          <w:sz w:val="21"/>
+          <w:szCs w:val="21"/>
+        </w:rPr>
+        <w:t xml:space="preserve">WikiArquitectura — Rietveld-Schröder House (en.wikiarquitectura.com).</w:t>
+      </w:r>
+    </w:p>
+    <w:p>
+      <w:pPr>
+        <w:spacing w:after="60" w:line="276"/>
+      </w:pPr>
+      <w:r>
+        <w:rPr>
+          <w:sz w:val="21"/>
+          <w:szCs w:val="21"/>
+        </w:rPr>
         <w:t xml:space="preserve">Kröller-Müller Museum — Rietveld Pavilion (krollermuller.nl).</w:t>
       </w:r>
     </w:p>
@@ -4574,7 +4534,31 @@
           <w:sz w:val="21"/>
           <w:szCs w:val="21"/>
         </w:rPr>
-        <w:t xml:space="preserve">Plans, day/night scheme and Van Gogh Museum section: own simplified drawings (not to scale).</w:t>
+        <w:t xml:space="preserve">Ground floor plan: ArchDaily, “AD Classics: Rietveld Schröder House”.</w:t>
+      </w:r>
+    </w:p>
+    <w:p>
+      <w:pPr>
+        <w:spacing w:after="60" w:line="276"/>
+      </w:pPr>
+      <w:r>
+        <w:rPr>
+          <w:sz w:val="21"/>
+          <w:szCs w:val="21"/>
+        </w:rPr>
+        <w:t xml:space="preserve">Upper-floor plans (open and closed) and photos of the upper floor today: Wikimedia Commons (RietveldSchroderPlans.png; photo series “Дом Шрёдер”).</w:t>
+      </w:r>
+    </w:p>
+    <w:p>
+      <w:pPr>
+        <w:spacing w:after="60" w:line="276"/>
+      </w:pPr>
+      <w:r>
+        <w:rPr>
+          <w:sz w:val="21"/>
+          <w:szCs w:val="21"/>
+        </w:rPr>
+        <w:t xml:space="preserve">Van Gogh Museum interior: Wikimedia Commons (Treppenhaus Van Gogh Museum.jpg; Wiki Loves Art NL — jankie).</w:t>
       </w:r>
     </w:p>
     <w:sectPr>

</xml_diff>